<commit_message>
Added sources and goals for first and second trimester
</commit_message>
<xml_diff>
--- a/Research Document Ideas.docx
+++ b/Research Document Ideas.docx
@@ -145,10 +145,7 @@
     </w:p>
     <w:p>
       <w:r>
-        <w:t>D</w:t>
-      </w:r>
-      <w:r>
-        <w:t xml:space="preserve">ifferent tests over </w:t>
+        <w:t xml:space="preserve">Different tests over </w:t>
       </w:r>
       <w:r>
         <w:t>lan,</w:t>
@@ -159,15 +156,123 @@
     </w:p>
     <w:p>
       <w:r>
-        <w:t>T</w:t>
-      </w:r>
-      <w:r>
-        <w:t xml:space="preserve">est over ethernet and </w:t>
+        <w:t xml:space="preserve">Test over ethernet and </w:t>
       </w:r>
       <w:r>
         <w:t>Wi-Fi</w:t>
       </w:r>
     </w:p>
+    <w:p>
+      <w:r>
+        <w:t>when the host car is driving the network simulation will either</w:t>
+      </w:r>
+      <w:r>
+        <w:t xml:space="preserve"> make the car</w:t>
+      </w:r>
+      <w:r>
+        <w:t xml:space="preserve"> lag behind</w:t>
+      </w:r>
+      <w:r>
+        <w:t>,</w:t>
+      </w:r>
+      <w:r>
+        <w:t xml:space="preserve"> go off into the distance</w:t>
+      </w:r>
+      <w:r>
+        <w:t>,</w:t>
+      </w:r>
+      <w:r>
+        <w:t xml:space="preserve"> or stay close and smooth. The idea is for it to be close and smooth but for the simulation that is how it should work. </w:t>
+      </w:r>
+    </w:p>
+    <w:p>
+      <w:r>
+        <w:t>There can be a client connected and in real time if I adjust the packet loss to more it will fall behind or be delayed but then in real time if I adjust it closer to 0 it will be more accurate than before.</w:t>
+      </w:r>
+    </w:p>
+    <w:p/>
+    <w:p>
+      <w:r>
+        <w:t>Compare client side and server side physics.</w:t>
+      </w:r>
+    </w:p>
+    <w:p/>
+    <w:p/>
+    <w:p/>
+    <w:p/>
+    <w:p>
+      <w:r>
+        <w:lastRenderedPageBreak/>
+        <w:t>Generic sources</w:t>
+      </w:r>
+    </w:p>
+    <w:p>
+      <w:hyperlink r:id="rId4" w:history="1">
+        <w:r>
+          <w:rPr>
+            <w:rStyle w:val="Hyperlink"/>
+          </w:rPr>
+          <w:t>https://6it.dev/blog/almost-zero-additional-latency-udp-over-tcp-1403</w:t>
+        </w:r>
+      </w:hyperlink>
+    </w:p>
+    <w:p/>
+    <w:p>
+      <w:hyperlink r:id="rId5" w:history="1">
+        <w:r>
+          <w:rPr>
+            <w:rStyle w:val="Hyperlink"/>
+          </w:rPr>
+          <w:t>https://gith</w:t>
+        </w:r>
+        <w:r>
+          <w:rPr>
+            <w:rStyle w:val="Hyperlink"/>
+          </w:rPr>
+          <w:t>u</w:t>
+        </w:r>
+        <w:r>
+          <w:rPr>
+            <w:rStyle w:val="Hyperlink"/>
+          </w:rPr>
+          <w:t>b.com/unity-technologies/com.unity.multiplayer.docs/blob/main/docs/learn/dealing-with-latency.md</w:t>
+        </w:r>
+      </w:hyperlink>
+    </w:p>
+    <w:p/>
+    <w:p>
+      <w:hyperlink r:id="rId6" w:history="1">
+        <w:r>
+          <w:rPr>
+            <w:rStyle w:val="Hyperlink"/>
+          </w:rPr>
+          <w:t>https://genieee.com/blogs/10-expert-tips-for-enhancing-multiplayer-game-performance-in-unity/</w:t>
+        </w:r>
+      </w:hyperlink>
+    </w:p>
+    <w:p/>
+    <w:p/>
+    <w:p>
+      <w:r>
+        <w:t>More specific sources</w:t>
+      </w:r>
+    </w:p>
+    <w:p/>
+    <w:p>
+      <w:r>
+        <w:t>can I use UDP and TCP on the same project for different variables/ to visualize the difference between them.</w:t>
+      </w:r>
+    </w:p>
+    <w:p>
+      <w:hyperlink r:id="rId7" w:history="1">
+        <w:r>
+          <w:rPr>
+            <w:rStyle w:val="Hyperlink"/>
+          </w:rPr>
+          <w:t>https://gamedev.stackexchange.com/questions/120115/does-it-make-sense-to-use-both-tcp-and-udp-at-once</w:t>
+        </w:r>
+      </w:hyperlink>
+    </w:p>
     <w:p/>
     <w:p>
       <w:r>
@@ -175,7 +280,7 @@
       </w:r>
     </w:p>
     <w:p>
-      <w:hyperlink r:id="rId4" w:history="1">
+      <w:hyperlink r:id="rId8" w:history="1">
         <w:r>
           <w:rPr>
             <w:rStyle w:val="Hyperlink"/>
@@ -186,18 +291,57 @@
     </w:p>
     <w:p/>
     <w:p>
-      <w:hyperlink r:id="rId5" w:history="1">
+      <w:r>
+        <w:t>Multiplayer Kart Video</w:t>
+      </w:r>
+    </w:p>
+    <w:p>
+      <w:hyperlink r:id="rId9" w:history="1">
         <w:r>
           <w:rPr>
             <w:rStyle w:val="Hyperlink"/>
           </w:rPr>
-          <w:t>https://6it.dev/blog/almost-zero-additional-latency-udp-over-tcp-1403</w:t>
+          <w:t>https://www.yout</w:t>
+        </w:r>
+        <w:r>
+          <w:rPr>
+            <w:rStyle w:val="Hyperlink"/>
+          </w:rPr>
+          <w:t>u</w:t>
+        </w:r>
+        <w:r>
+          <w:rPr>
+            <w:rStyle w:val="Hyperlink"/>
+          </w:rPr>
+          <w:t>be.com/watch?v=-lGsuCEWkM0</w:t>
         </w:r>
       </w:hyperlink>
     </w:p>
     <w:p/>
-    <w:p>
-      <w:hyperlink r:id="rId6" w:history="1">
+    <w:p/>
+    <w:p/>
+    <w:p/>
+    <w:p/>
+    <w:p/>
+    <w:p>
+      <w:r>
+        <w:lastRenderedPageBreak/>
+        <w:t xml:space="preserve">Unity documentation </w:t>
+      </w:r>
+    </w:p>
+    <w:p>
+      <w:hyperlink r:id="rId10" w:history="1">
+        <w:r>
+          <w:rPr>
+            <w:rStyle w:val="Hyperlink"/>
+          </w:rPr>
+          <w:t>https://unity.com/blog/multiplayer-networking-ebook</w:t>
+        </w:r>
+      </w:hyperlink>
+    </w:p>
+    <w:p/>
+    <w:p>
+      <w:hyperlink r:id="rId11" w:history="1">
         <w:r>
           <w:rPr>
             <w:rStyle w:val="Hyperlink"/>
@@ -207,16 +351,71 @@
       </w:hyperlink>
     </w:p>
     <w:p/>
-    <w:p/>
-    <w:p>
-      <w:r>
-        <w:lastRenderedPageBreak/>
-        <w:t xml:space="preserve">when the host car is driving the network simulation will either lag behind go off into the distance or stay close and smooth. The idea is for it to be close and smooth but for the simulation that is how it should work. </w:t>
-      </w:r>
-    </w:p>
-    <w:p>
-      <w:r>
-        <w:t>There can be a client connected and in real time if I adjust the packet loss to more it will fall behind or be delayed but then in real time if I adjust it closer to 0 it will be more accurate than before.</w:t>
+    <w:p>
+      <w:hyperlink r:id="rId12" w:history="1">
+        <w:r>
+          <w:rPr>
+            <w:rStyle w:val="Hyperlink"/>
+          </w:rPr>
+          <w:t>https://discussions.unity.com/t/best-approach-for-handling-physics-objects-in-a-networked-game/788691</w:t>
+        </w:r>
+      </w:hyperlink>
+    </w:p>
+    <w:p/>
+    <w:p>
+      <w:hyperlink r:id="rId13" w:history="1">
+        <w:r>
+          <w:rPr>
+            <w:rStyle w:val="Hyperlink"/>
+          </w:rPr>
+          <w:t>https://docs.unity3d.com/Packages/com.unity.netcode.gameobjects@3.0/manual/latency-performance.html</w:t>
+        </w:r>
+      </w:hyperlink>
+    </w:p>
+    <w:p/>
+    <w:p/>
+    <w:p>
+      <w:r>
+        <w:t xml:space="preserve">First trimester </w:t>
+      </w:r>
+    </w:p>
+    <w:p/>
+    <w:p>
+      <w:r>
+        <w:t xml:space="preserve">Make a prototype for the car physics </w:t>
+      </w:r>
+    </w:p>
+    <w:p>
+      <w:r>
+        <w:t>Introduce artificial latency ,jitter and packet loss</w:t>
+      </w:r>
+    </w:p>
+    <w:p>
+      <w:r>
+        <w:t>Change network conditions while the game is running</w:t>
+      </w:r>
+    </w:p>
+    <w:p>
+      <w:r>
+        <w:t xml:space="preserve">Test using lan/wan </w:t>
+      </w:r>
+    </w:p>
+    <w:p/>
+    <w:p>
+      <w:r>
+        <w:t xml:space="preserve">Second trimester </w:t>
+      </w:r>
+    </w:p>
+    <w:p/>
+    <w:p/>
+    <w:p>
+      <w:r>
+        <w:t xml:space="preserve">Progress check </w:t>
+      </w:r>
+    </w:p>
+    <w:p>
+      <w:r>
+        <w:t>Add car project for testing platform</w:t>
       </w:r>
     </w:p>
     <w:sectPr>
@@ -832,6 +1031,7 @@
   <w:style w:type="character" w:default="1" w:styleId="DefaultParagraphFont">
     <w:name w:val="Default Paragraph Font"/>
     <w:uiPriority w:val="1"/>
+    <w:semiHidden/>
     <w:unhideWhenUsed/>
   </w:style>
   <w:style w:type="table" w:default="1" w:styleId="TableNormal">
@@ -1166,6 +1366,18 @@
     <w:rPr>
       <w:color w:val="605E5C"/>
       <w:shd w:val="clear" w:color="auto" w:fill="E1DFDD"/>
+    </w:rPr>
+  </w:style>
+  <w:style w:type="character" w:styleId="FollowedHyperlink">
+    <w:name w:val="FollowedHyperlink"/>
+    <w:basedOn w:val="DefaultParagraphFont"/>
+    <w:uiPriority w:val="99"/>
+    <w:semiHidden/>
+    <w:unhideWhenUsed/>
+    <w:rsid w:val="00940D56"/>
+    <w:rPr>
+      <w:color w:val="96607D" w:themeColor="followedHyperlink"/>
+      <w:u w:val="single"/>
     </w:rPr>
   </w:style>
 </w:styles>

</xml_diff>

<commit_message>
Setting Up File Architecture
</commit_message>
<xml_diff>
--- a/Research Document Ideas.docx
+++ b/Research Document Ideas.docx
@@ -170,13 +170,8 @@
         <w:t xml:space="preserve"> make the car</w:t>
       </w:r>
       <w:r>
-        <w:t xml:space="preserve"> </w:t>
-      </w:r>
-      <w:proofErr w:type="gramStart"/>
-      <w:r>
-        <w:t>lag behind</w:t>
-      </w:r>
-      <w:proofErr w:type="gramEnd"/>
+        <w:t xml:space="preserve"> lag behind</w:t>
+      </w:r>
       <w:r>
         <w:t>,</w:t>
       </w:r>
@@ -198,15 +193,7 @@
     <w:p/>
     <w:p>
       <w:r>
-        <w:t xml:space="preserve">Compare client side and </w:t>
-      </w:r>
-      <w:proofErr w:type="gramStart"/>
-      <w:r>
-        <w:t>server side</w:t>
-      </w:r>
-      <w:proofErr w:type="gramEnd"/>
-      <w:r>
-        <w:t xml:space="preserve"> physics.</w:t>
+        <w:t>Compare client side and server side physics.</w:t>
       </w:r>
     </w:p>
     <w:p/>
@@ -430,22 +417,20 @@
     </w:p>
     <w:p/>
     <w:p/>
-    <w:p>
-      <w:r>
-        <w:t xml:space="preserve">Tri, one </w:t>
-      </w:r>
-      <w:proofErr w:type="gramStart"/>
-      <w:r>
-        <w:t>make</w:t>
-      </w:r>
-      <w:proofErr w:type="gramEnd"/>
-      <w:r>
-        <w:t xml:space="preserve"> the players see each other </w:t>
-      </w:r>
-    </w:p>
-    <w:p>
-      <w:r>
-        <w:t>Tri 2 simulates the latency and test on other machines</w:t>
+    <w:p/>
+    <w:p>
+      <w:r>
+        <w:t>Have 2 cars</w:t>
+      </w:r>
+    </w:p>
+    <w:p>
+      <w:r>
+        <w:t>Take a snapshot of the cars position, rotation and vectors to predict where it should end up which is what the other players will see.</w:t>
+      </w:r>
+    </w:p>
+    <w:p>
+      <w:r>
+        <w:t xml:space="preserve">And the other car will be the source of truth which is what has actually happened one that the client will see </w:t>
       </w:r>
     </w:p>
     <w:sectPr>

</xml_diff>

<commit_message>
Can send snapshots to the console
</commit_message>
<xml_diff>
--- a/Research Document Ideas.docx
+++ b/Research Document Ideas.docx
@@ -170,8 +170,13 @@
         <w:t xml:space="preserve"> make the car</w:t>
       </w:r>
       <w:r>
-        <w:t xml:space="preserve"> lag behind</w:t>
-      </w:r>
+        <w:t xml:space="preserve"> </w:t>
+      </w:r>
+      <w:proofErr w:type="gramStart"/>
+      <w:r>
+        <w:t>lag behind</w:t>
+      </w:r>
+      <w:proofErr w:type="gramEnd"/>
       <w:r>
         <w:t>,</w:t>
       </w:r>
@@ -193,7 +198,15 @@
     <w:p/>
     <w:p>
       <w:r>
-        <w:t>Compare client side and server side physics.</w:t>
+        <w:t xml:space="preserve">Compare client side and </w:t>
+      </w:r>
+      <w:proofErr w:type="gramStart"/>
+      <w:r>
+        <w:t>server side</w:t>
+      </w:r>
+      <w:proofErr w:type="gramEnd"/>
+      <w:r>
+        <w:t xml:space="preserve"> physics.</w:t>
       </w:r>
     </w:p>
     <w:p/>
@@ -347,6 +360,27 @@
       </w:hyperlink>
     </w:p>
     <w:p/>
+    <w:p>
+      <w:hyperlink r:id="rId14" w:history="1">
+        <w:r>
+          <w:rPr>
+            <w:rStyle w:val="Hyperlink"/>
+          </w:rPr>
+          <w:t>https://docs.unity3d.com/Packages/com.unity.netcode.gameobjects@2.4/manual/advanced-topics/serialization/inetworkserializable.html</w:t>
+        </w:r>
+      </w:hyperlink>
+    </w:p>
+    <w:p/>
+    <w:p>
+      <w:hyperlink r:id="rId15" w:history="1">
+        <w:r>
+          <w:rPr>
+            <w:rStyle w:val="Hyperlink"/>
+          </w:rPr>
+          <w:t>https://docs.unity3d.com/Packages/com.unity.netcode@7.1/manual/ghost-snapshots.html</w:t>
+        </w:r>
+      </w:hyperlink>
+    </w:p>
     <w:p/>
     <w:p>
       <w:r>
@@ -430,9 +464,26 @@
     </w:p>
     <w:p>
       <w:r>
-        <w:t xml:space="preserve">And the other car will be the source of truth which is what has actually happened one that the client will see </w:t>
-      </w:r>
-    </w:p>
+        <w:t xml:space="preserve">And the other car will be the source of truth which is what has </w:t>
+      </w:r>
+      <w:proofErr w:type="gramStart"/>
+      <w:r>
+        <w:t>actually happened</w:t>
+      </w:r>
+      <w:proofErr w:type="gramEnd"/>
+      <w:r>
+        <w:t xml:space="preserve"> one that the client will see </w:t>
+      </w:r>
+    </w:p>
+    <w:p/>
+    <w:p>
+      <w:r>
+        <w:t>Compare the predicted position vs the actual position</w:t>
+      </w:r>
+    </w:p>
+    <w:p/>
+    <w:p/>
+    <w:p/>
     <w:sectPr>
       <w:pgSz w:w="11906" w:h="16838"/>
       <w:pgMar w:top="1440" w:right="1440" w:bottom="1440" w:left="1440" w:header="708" w:footer="708" w:gutter="0"/>

</xml_diff>